<commit_message>
Add ENCO services ecosystem to OBITI map and Anufriev DI
CRM processes in the DI are system-agnostic (no MacroCRM / 1C CRM).
Section 3.5 / 4.5 cover CRM methodology and back-office of the five
ENCO services. Canvas gets a dedicated ecosystem panel, RACI row,
and profile updates.

Co-authored-by: anufrievpg <anufrievpg@users.noreply.github.com>
</commit_message>
<xml_diff>
--- a/enco-obiti/files/ДИ Руководитель блока процессной аналитики и AI Ануфриев Павел 2025.docx
+++ b/enco-obiti/files/ДИ Руководитель блока процессной аналитики и AI Ануфриев Павел 2025.docx
@@ -688,7 +688,7 @@
           <w:sz w:val="24"/>
           <w:szCs w:val="24"/>
         </w:rPr>
-        <w:t>3.5. Руководство блоком процессной аналитики и AI-трансформации, обучение пользователей и управление изменениями.</w:t>
+        <w:t>3.5. Руководство блоком процессной аналитики и AI-трансформации; процессы и методологии CRM; бэкофис Экосистемы сервисов ЭНКО; обучение пользователей и управление изменениями.</w:t>
       </w:r>
     </w:p>
     <w:p>
@@ -1188,7 +1188,7 @@
           <w:sz w:val="24"/>
           <w:szCs w:val="24"/>
         </w:rPr>
-        <w:t xml:space="preserve">4.5.1. Руководит блоком процессной аналитики и AI-трансформации (в т.ч. главный бизнес-аналитик, аналитик MacroCRM, руководитель проекта MacroCRM).</w:t>
+        <w:t>4.5.1. Руководит блоком процессной аналитики и AI-трансформации. Обеспечивает процессы и методологии CRM (без привязки к конкретной системе).</w:t>
       </w:r>
     </w:p>
     <w:p>
@@ -1265,6 +1265,25 @@
           <w:szCs w:val="24"/>
         </w:rPr>
         <w:t xml:space="preserve">4.5.5. Информирует заказчиков и стейкхолдеров о статусе методологических инициатив; готовит отчёты и материалы для руководства.</w:t>
+      </w:r>
+    </w:p>
+    <w:p>
+      <w:pPr>
+        <w:contextualSpacing/>
+        <w:jc w:val="both"/>
+        <w:rPr>
+          <w:rFonts w:ascii="Arial" w:hAnsi="Arial" w:cs="Arial"/>
+          <w:sz w:val="24"/>
+          <w:szCs w:val="24"/>
+        </w:rPr>
+      </w:pPr>
+      <w:r>
+        <w:rPr>
+          <w:rFonts w:ascii="Arial" w:hAnsi="Arial" w:cs="Arial"/>
+          <w:sz w:val="24"/>
+          <w:szCs w:val="24"/>
+        </w:rPr>
+        <w:t xml:space="preserve">4.5.6. Обеспечивает процессы и методологию бэкофиса Экосистемы сервисов ЭНКО в контуре CRM: собственный умный дом (smarthome.enco.ru), Соседский центр, ЭНКО.Брокер, ЭНКО.Family (УК + ремонт), вторичка «От своих».</w:t>
       </w:r>
     </w:p>
     <w:p>
@@ -1462,7 +1481,7 @@
         </w:rPr>
         <w:t>•</w:t>
         <w:tab/>
-        <w:t>Методологии и регламенты ОБИТИ (MDM, УСЦ, процессные карты, OKR);</w:t>
+        <w:t>Методологии и регламенты ОБИТИ (MDM, УСЦ, процессы CRM, Экосистема сервисов ЭНКО, процессные карты, OKR);</w:t>
       </w:r>
       <w:r>
         <w:rPr>
@@ -1876,7 +1895,7 @@
               <w:rPr>
                 <w:rFonts w:ascii="Arial" w:hAnsi="Arial" w:cs="Arial"/>
               </w:rPr>
-              <w:t>• Понимание контура систем девелопера: УСЦ, 1С:ДО, CRM (MacroCRM), PPM, интеграционная шина (ESB).</w:t>
+              <w:t>• Понимание контура систем девелопера: УСЦ, 1С:ДО, процессы CRM (без привязки к конкретной системе), PPM, интеграционная шина (ESB).</w:t>
             </w:r>
             <w:proofErr w:type="spellStart"/>
             <w:r>
@@ -2253,7 +2272,7 @@
                 <w:sz w:val="24"/>
                 <w:szCs w:val="24"/>
               </w:rPr>
-              <w:t>Контур ОБИТИ: УСЦ, 1С:ДО, MacroCRM, PPM (портфельное управление).</w:t>
+              <w:t>Контур ОБИТИ: УСЦ, 1С:ДО, CRM (процессы и методология, без привязки к системе), PPM (портфельное управление).</w:t>
             </w:r>
             <w:proofErr w:type="spellStart"/>
             <w:r>

</xml_diff>